<commit_message>
feat: onlyoffice online editor
</commit_message>
<xml_diff>
--- a/SistemBeritaAcara.Web/wwwroot/files/documents/ba-19-draft.docx
+++ b/SistemBeritaAcara.Web/wwwroot/files/documents/ba-19-draft.docx
@@ -54,7 +54,7 @@
                           </pic:cNvPicPr>
                         </pic:nvPicPr>
                         <pic:blipFill rotWithShape="1">
-                          <a:blip r:embed="rId5" cstate="print">
+                          <a:blip r:embed="rId6" cstate="print">
                             <a:extLst>
                               <a:ext uri="{28A0092B-C50C-407E-A947-70E740481C1C}">
                                 <a14:useLocalDpi xmlns:a14="http://schemas.microsoft.com/office/drawing/2010/main" val="0"/>
@@ -228,15 +228,14 @@
               <w:tblStyle w:val="TableGrid"/>
               <w:tblW w:w="0" w:type="auto"/>
               <w:tblBorders>
-                <w:insideH w:val="none" w:color="auto" w:sz="0" w:space="0"/>
                 <w:insideV w:val="none" w:color="auto" w:sz="0" w:space="0"/>
               </w:tblBorders>
               <w:tblLook w:val="04A0" w:firstRow="1" w:lastRow="0" w:firstColumn="1" w:lastColumn="0" w:noHBand="0" w:noVBand="1"/>
             </w:tblPr>
             <w:tblGrid>
-              <w:gridCol w:w="1466"/>
+              <w:gridCol w:w="1473"/>
               <w:gridCol w:w="272"/>
-              <w:gridCol w:w="2719"/>
+              <w:gridCol w:w="2712"/>
             </w:tblGrid>
             <w:tr>
               <w:tc>
@@ -887,17 +886,8 @@
                 <w:sz w:val="18"/>
                 <w:szCs w:val="18"/>
               </w:rPr>
-              <w:t xml:space="preserve">Rel. &amp; Project Dev. Sumbagsel</w:t>
-            </w:r>
-            <w:proofErr w:type="spellStart"/>
-            <w:r>
-              <w:rPr>
-                <w:sz w:val="18"/>
-                <w:szCs w:val="18"/>
-              </w:rPr>
-              <w:t/>
-            </w:r>
-            <w:proofErr w:type="spellEnd"/>
+              <w:t>Rel. &amp; Project Dev. Sumbagsel</w:t>
+            </w:r>
           </w:p>
         </w:tc>
       </w:tr>
@@ -977,17 +967,8 @@
                 <w:sz w:val="18"/>
                 <w:szCs w:val="18"/>
               </w:rPr>
-              <w:t xml:space="preserve">Rel. &amp; Project Dev. Sumbagsel</w:t>
-            </w:r>
-            <w:proofErr w:type="spellStart"/>
-            <w:r>
-              <w:rPr>
-                <w:sz w:val="18"/>
-                <w:szCs w:val="18"/>
-              </w:rPr>
-              <w:t/>
-            </w:r>
-            <w:proofErr w:type="spellEnd"/>
+              <w:t>Rel. &amp; Project Dev. Sumbagsel</w:t>
+            </w:r>
           </w:p>
         </w:tc>
       </w:tr>
@@ -1258,7 +1239,6 @@
           <w:bCs/>
           <w:sz w:val="18"/>
           <w:szCs w:val="18"/>
-          <w:lang w:val="nb-NO"/>
         </w:rPr>
       </w:pPr>
       <w:r>
@@ -1267,47 +1247,46 @@
           <w:bCs/>
           <w:sz w:val="18"/>
           <w:szCs w:val="18"/>
-          <w:lang w:val="nb-NO"/>
-        </w:rPr>
-        <w:t xml:space="preserve">Pada hari ini </w:t>
-      </w:r>
+        </w:rPr>
+        <w:t xml:space="preserve">Pada </w:t>
+      </w:r>
+      <w:proofErr w:type="spellStart"/>
       <w:r>
         <w:rPr>
           <w:b/>
           <w:bCs/>
           <w:sz w:val="18"/>
           <w:szCs w:val="18"/>
-          <w:lang w:val="nb-NO"/>
-        </w:rPr>
-        <w:t>Rabu</w:t>
-      </w:r>
+        </w:rPr>
+        <w:t>hari</w:t>
+      </w:r>
+      <w:proofErr w:type="spellEnd"/>
       <w:r>
         <w:rPr>
           <w:b/>
           <w:bCs/>
           <w:sz w:val="18"/>
           <w:szCs w:val="18"/>
-          <w:lang w:val="nb-NO"/>
-        </w:rPr>
-        <w:t xml:space="preserve"> Tanggal </w:t>
-      </w:r>
+        </w:rPr>
+        <w:t xml:space="preserve"> </w:t>
+      </w:r>
+      <w:proofErr w:type="spellStart"/>
       <w:r>
         <w:rPr>
           <w:b/>
           <w:bCs/>
           <w:sz w:val="18"/>
           <w:szCs w:val="18"/>
-          <w:lang w:val="nb-NO"/>
-        </w:rPr>
-        <w:t>17</w:t>
-      </w:r>
+        </w:rPr>
+        <w:t>ini</w:t>
+      </w:r>
+      <w:proofErr w:type="spellEnd"/>
       <w:r>
         <w:rPr>
           <w:b/>
           <w:bCs/>
           <w:sz w:val="18"/>
           <w:szCs w:val="18"/>
-          <w:lang w:val="nb-NO"/>
         </w:rPr>
         <w:t xml:space="preserve"> </w:t>
       </w:r>
@@ -1317,19 +1296,353 @@
           <w:bCs/>
           <w:sz w:val="18"/>
           <w:szCs w:val="18"/>
-          <w:lang w:val="nb-NO"/>
-        </w:rPr>
-        <w:t>Juni</w:t>
-      </w:r>
+        </w:rPr>
+        <w:t>{{</w:t>
+      </w:r>
+      <w:proofErr w:type="spellStart"/>
       <w:r>
         <w:rPr>
           <w:b/>
           <w:bCs/>
           <w:sz w:val="18"/>
           <w:szCs w:val="18"/>
-          <w:lang w:val="nb-NO"/>
-        </w:rPr>
-        <w:t xml:space="preserve"> 2026 telah diserahterimakan perangkat dengan spesifikasi serta syarat-syarat dan ketentuan sebagai berikut:</w:t>
+        </w:rPr>
+        <w:t>HariTanggal</w:t>
+      </w:r>
+      <w:proofErr w:type="spellEnd"/>
+      <w:r>
+        <w:rPr>
+          <w:b/>
+          <w:bCs/>
+          <w:sz w:val="18"/>
+          <w:szCs w:val="18"/>
+        </w:rPr>
+        <w:t>}}</w:t>
+      </w:r>
+      <w:r>
+        <w:rPr>
+          <w:b/>
+          <w:bCs/>
+          <w:sz w:val="18"/>
+          <w:szCs w:val="18"/>
+        </w:rPr>
+        <w:t xml:space="preserve"> </w:t>
+      </w:r>
+      <w:proofErr w:type="spellStart"/>
+      <w:r>
+        <w:rPr>
+          <w:b/>
+          <w:bCs/>
+          <w:sz w:val="18"/>
+          <w:szCs w:val="18"/>
+        </w:rPr>
+        <w:t>Tanggal</w:t>
+      </w:r>
+      <w:proofErr w:type="spellEnd"/>
+      <w:r>
+        <w:rPr>
+          <w:b/>
+          <w:bCs/>
+          <w:sz w:val="18"/>
+          <w:szCs w:val="18"/>
+        </w:rPr>
+        <w:t xml:space="preserve"> </w:t>
+      </w:r>
+      <w:r>
+        <w:rPr>
+          <w:b/>
+          <w:bCs/>
+          <w:sz w:val="18"/>
+          <w:szCs w:val="18"/>
+        </w:rPr>
+        <w:t>{{</w:t>
+      </w:r>
+      <w:proofErr w:type="spellStart"/>
+      <w:r>
+        <w:rPr>
+          <w:b/>
+          <w:bCs/>
+          <w:sz w:val="18"/>
+          <w:szCs w:val="18"/>
+        </w:rPr>
+        <w:t>TanggalAngka</w:t>
+      </w:r>
+      <w:proofErr w:type="spellEnd"/>
+      <w:r>
+        <w:rPr>
+          <w:b/>
+          <w:bCs/>
+          <w:sz w:val="18"/>
+          <w:szCs w:val="18"/>
+        </w:rPr>
+        <w:t>}}</w:t>
+      </w:r>
+      <w:r>
+        <w:rPr>
+          <w:b/>
+          <w:bCs/>
+          <w:sz w:val="18"/>
+          <w:szCs w:val="18"/>
+        </w:rPr>
+        <w:t xml:space="preserve"> </w:t>
+      </w:r>
+      <w:r>
+        <w:rPr>
+          <w:b/>
+          <w:bCs/>
+          <w:sz w:val="18"/>
+          <w:szCs w:val="18"/>
+        </w:rPr>
+        <w:t>{{</w:t>
+      </w:r>
+      <w:proofErr w:type="spellStart"/>
+      <w:r>
+        <w:rPr>
+          <w:b/>
+          <w:bCs/>
+          <w:sz w:val="18"/>
+          <w:szCs w:val="18"/>
+        </w:rPr>
+        <w:t>BulanTanggal</w:t>
+      </w:r>
+      <w:proofErr w:type="spellEnd"/>
+      <w:r>
+        <w:rPr>
+          <w:b/>
+          <w:bCs/>
+          <w:sz w:val="18"/>
+          <w:szCs w:val="18"/>
+        </w:rPr>
+        <w:t>}}</w:t>
+      </w:r>
+      <w:r>
+        <w:rPr>
+          <w:b/>
+          <w:bCs/>
+          <w:sz w:val="18"/>
+          <w:szCs w:val="18"/>
+        </w:rPr>
+        <w:t xml:space="preserve"> {{</w:t>
+      </w:r>
+      <w:proofErr w:type="spellStart"/>
+      <w:r>
+        <w:rPr>
+          <w:b/>
+          <w:bCs/>
+          <w:sz w:val="18"/>
+          <w:szCs w:val="18"/>
+        </w:rPr>
+        <w:t>TahunTanggal</w:t>
+      </w:r>
+      <w:proofErr w:type="spellEnd"/>
+      <w:r>
+        <w:rPr>
+          <w:b/>
+          <w:bCs/>
+          <w:sz w:val="18"/>
+          <w:szCs w:val="18"/>
+        </w:rPr>
+        <w:t xml:space="preserve">}} </w:t>
+      </w:r>
+      <w:proofErr w:type="spellStart"/>
+      <w:r>
+        <w:rPr>
+          <w:b/>
+          <w:bCs/>
+          <w:sz w:val="18"/>
+          <w:szCs w:val="18"/>
+        </w:rPr>
+        <w:t>telah</w:t>
+      </w:r>
+      <w:proofErr w:type="spellEnd"/>
+      <w:r>
+        <w:rPr>
+          <w:b/>
+          <w:bCs/>
+          <w:sz w:val="18"/>
+          <w:szCs w:val="18"/>
+        </w:rPr>
+        <w:t xml:space="preserve"> </w:t>
+      </w:r>
+      <w:proofErr w:type="spellStart"/>
+      <w:r>
+        <w:rPr>
+          <w:b/>
+          <w:bCs/>
+          <w:sz w:val="18"/>
+          <w:szCs w:val="18"/>
+        </w:rPr>
+        <w:t>diserahterimakan</w:t>
+      </w:r>
+      <w:proofErr w:type="spellEnd"/>
+      <w:r>
+        <w:rPr>
+          <w:b/>
+          <w:bCs/>
+          <w:sz w:val="18"/>
+          <w:szCs w:val="18"/>
+        </w:rPr>
+        <w:t xml:space="preserve"> </w:t>
+      </w:r>
+      <w:proofErr w:type="spellStart"/>
+      <w:r>
+        <w:rPr>
+          <w:b/>
+          <w:bCs/>
+          <w:sz w:val="18"/>
+          <w:szCs w:val="18"/>
+        </w:rPr>
+        <w:t>perangkat</w:t>
+      </w:r>
+      <w:proofErr w:type="spellEnd"/>
+      <w:r>
+        <w:rPr>
+          <w:b/>
+          <w:bCs/>
+          <w:sz w:val="18"/>
+          <w:szCs w:val="18"/>
+        </w:rPr>
+        <w:t xml:space="preserve"> </w:t>
+      </w:r>
+      <w:proofErr w:type="spellStart"/>
+      <w:r>
+        <w:rPr>
+          <w:b/>
+          <w:bCs/>
+          <w:sz w:val="18"/>
+          <w:szCs w:val="18"/>
+        </w:rPr>
+        <w:t>dengan</w:t>
+      </w:r>
+      <w:proofErr w:type="spellEnd"/>
+      <w:r>
+        <w:rPr>
+          <w:b/>
+          <w:bCs/>
+          <w:sz w:val="18"/>
+          <w:szCs w:val="18"/>
+        </w:rPr>
+        <w:t xml:space="preserve"> </w:t>
+      </w:r>
+      <w:proofErr w:type="spellStart"/>
+      <w:r>
+        <w:rPr>
+          <w:b/>
+          <w:bCs/>
+          <w:sz w:val="18"/>
+          <w:szCs w:val="18"/>
+        </w:rPr>
+        <w:t>spesifikasi</w:t>
+      </w:r>
+      <w:proofErr w:type="spellEnd"/>
+      <w:r>
+        <w:rPr>
+          <w:b/>
+          <w:bCs/>
+          <w:sz w:val="18"/>
+          <w:szCs w:val="18"/>
+        </w:rPr>
+        <w:t xml:space="preserve"> </w:t>
+      </w:r>
+      <w:proofErr w:type="spellStart"/>
+      <w:r>
+        <w:rPr>
+          <w:b/>
+          <w:bCs/>
+          <w:sz w:val="18"/>
+          <w:szCs w:val="18"/>
+        </w:rPr>
+        <w:t>serta</w:t>
+      </w:r>
+      <w:proofErr w:type="spellEnd"/>
+      <w:r>
+        <w:rPr>
+          <w:b/>
+          <w:bCs/>
+          <w:sz w:val="18"/>
+          <w:szCs w:val="18"/>
+        </w:rPr>
+        <w:t xml:space="preserve"> </w:t>
+      </w:r>
+      <w:proofErr w:type="spellStart"/>
+      <w:r>
+        <w:rPr>
+          <w:b/>
+          <w:bCs/>
+          <w:sz w:val="18"/>
+          <w:szCs w:val="18"/>
+        </w:rPr>
+        <w:t>syarat-syarat</w:t>
+      </w:r>
+      <w:proofErr w:type="spellEnd"/>
+      <w:r>
+        <w:rPr>
+          <w:b/>
+          <w:bCs/>
+          <w:sz w:val="18"/>
+          <w:szCs w:val="18"/>
+        </w:rPr>
+        <w:t xml:space="preserve"> dan </w:t>
+      </w:r>
+      <w:proofErr w:type="spellStart"/>
+      <w:r>
+        <w:rPr>
+          <w:b/>
+          <w:bCs/>
+          <w:sz w:val="18"/>
+          <w:szCs w:val="18"/>
+        </w:rPr>
+        <w:t>ketentuan</w:t>
+      </w:r>
+      <w:proofErr w:type="spellEnd"/>
+      <w:r>
+        <w:rPr>
+          <w:b/>
+          <w:bCs/>
+          <w:sz w:val="18"/>
+          <w:szCs w:val="18"/>
+        </w:rPr>
+        <w:t xml:space="preserve"> </w:t>
+      </w:r>
+      <w:proofErr w:type="spellStart"/>
+      <w:r>
+        <w:rPr>
+          <w:b/>
+          <w:bCs/>
+          <w:sz w:val="18"/>
+          <w:szCs w:val="18"/>
+        </w:rPr>
+        <w:t>sebagai</w:t>
+      </w:r>
+      <w:proofErr w:type="spellEnd"/>
+      <w:r>
+        <w:rPr>
+          <w:b/>
+          <w:bCs/>
+          <w:sz w:val="18"/>
+          <w:szCs w:val="18"/>
+        </w:rPr>
+        <w:t xml:space="preserve"> </w:t>
+      </w:r>
+      <w:proofErr w:type="spellStart"/>
+      <w:r>
+        <w:rPr>
+          <w:b/>
+          <w:bCs/>
+          <w:sz w:val="18"/>
+          <w:szCs w:val="18"/>
+        </w:rPr>
+        <w:t>berikut</w:t>
+      </w:r>
+      <w:proofErr w:type="spellEnd"/>
+      <w:r>
+        <w:rPr>
+          <w:b/>
+          <w:bCs/>
+          <w:sz w:val="18"/>
+          <w:szCs w:val="18"/>
+        </w:rPr>
+        <w:t>:</w:t>
       </w:r>
     </w:p>
     <w:p>
@@ -1338,7 +1651,6 @@
         <w:rPr>
           <w:sz w:val="18"/>
           <w:szCs w:val="18"/>
-          <w:lang w:val="nb-NO"/>
         </w:rPr>
       </w:pPr>
     </w:p>
@@ -1467,6 +1779,7 @@
                   <w:pPr>
                     <w:pStyle w:val="ListParagraph"/>
                     <w:ind w:left="0"/>
+                    <w:jc w:val="center"/>
                     <w:rPr>
                       <w:b/>
                       <w:bCs/>
@@ -1560,6 +1873,7 @@
                   <w:pPr>
                     <w:pStyle w:val="ListParagraph"/>
                     <w:ind w:left="0"/>
+                    <w:jc w:val="center"/>
                     <w:rPr>
                       <w:b/>
                       <w:bCs/>
@@ -1632,6 +1946,7 @@
                   <w:pPr>
                     <w:pStyle w:val="ListParagraph"/>
                     <w:ind w:left="0"/>
+                    <w:jc w:val="center"/>
                     <w:rPr>
                       <w:b/>
                       <w:bCs/>
@@ -1726,6 +2041,7 @@
             <w:pPr>
               <w:pStyle w:val="ListParagraph"/>
               <w:ind w:left="0"/>
+              <w:jc w:val="center"/>
               <w:rPr>
                 <w:b/>
                 <w:bCs/>
@@ -1773,6 +2089,7 @@
             <w:pPr>
               <w:pStyle w:val="ListParagraph"/>
               <w:ind w:left="0"/>
+              <w:jc w:val="center"/>
               <w:rPr>
                 <w:b/>
                 <w:bCs/>
@@ -1820,6 +2137,7 @@
             <w:pPr>
               <w:pStyle w:val="ListParagraph"/>
               <w:ind w:left="0"/>
+              <w:jc w:val="center"/>
               <w:rPr>
                 <w:b/>
                 <w:bCs/>
@@ -2244,17 +2562,6 @@
         </w:rPr>
         <w:t>:</w:t>
       </w:r>
-    </w:p>
-    <w:p>
-      <w:pPr>
-        <w:pStyle w:val="ListParagraph"/>
-        <w:spacing w:after="120" w:line="276" w:lineRule="auto"/>
-        <w:ind w:left="360"/>
-        <w:jc w:val="both"/>
-        <w:rPr>
-          <w:lang w:val="nb-NO"/>
-        </w:rPr>
-      </w:pPr>
     </w:p>
     <w:p>
       <w:pPr>
@@ -2470,24 +2777,9 @@
           </w:tcPr>
           <w:p>
             <w:pPr>
-              <w:pStyle w:val="ListParagraph"/>
               <w:ind w:left="0"/>
-              <w:rPr>
-                <w:b/>
-                <w:bCs/>
-                <w:noProof/>
-                <w:sz w:val="18"/>
-                <w:szCs w:val="18"/>
-                <w:u w:val="single"/>
-                <w:lang w:val="nb-NO"/>
-              </w:rPr>
-            </w:pPr>
-            <w:r>
-              <w:rPr>
-                <w:u w:val="none"/>
-              </w:rPr>
-              <w:br/>
-            </w:r>
+              <w:jc w:val="left"/>
+            </w:pPr>
             <w:r>
               <w:drawing>
                 <wp:inline distT="0" distB="0" distL="0" distR="0">
@@ -2505,7 +2797,7 @@
                           <pic:cNvPicPr/>
                         </pic:nvPicPr>
                         <pic:blipFill>
-                          <a:blip r:embed="R148ece96e7984414"/>
+                          <a:blip r:embed="R79b789a7af414ccb"/>
                           <a:stretch>
                             <a:fillRect/>
                           </a:stretch>
@@ -2525,6 +2817,21 @@
                 </wp:inline>
               </w:drawing>
             </w:r>
+          </w:p>
+          <w:p>
+            <w:pPr>
+              <w:pStyle w:val="ListParagraph"/>
+              <w:ind w:left="0"/>
+              <w:rPr>
+                <w:b/>
+                <w:bCs/>
+                <w:noProof/>
+                <w:sz w:val="18"/>
+                <w:szCs w:val="18"/>
+                <w:u w:val="single"/>
+                <w:lang w:val="nb-NO"/>
+              </w:rPr>
+            </w:pPr>
             <w:r>
               <w:rPr>
                 <w:sz w:val="18"/>
@@ -2544,6 +2851,12 @@
             <w:pPr>
               <w:pStyle w:val="ListParagraph"/>
               <w:ind w:left="0"/>
+              <w:rPr>
+                <w:sz w:val="18"/>
+                <w:szCs w:val="18"/>
+                <w:u w:val="single"/>
+                <w:lang w:val="nb-NO"/>
+              </w:rPr>
             </w:pPr>
             <w:r>
               <w:t>{{SIG_APPROVER}}</w:t>
@@ -2758,17 +3071,8 @@
           <w:sz w:val="18"/>
           <w:szCs w:val="18"/>
         </w:rPr>
-        <w:t xml:space="preserve">Rel. &amp; Project Dev. Sumbagsel</w:t>
-      </w:r>
-      <w:proofErr w:type="spellStart"/>
-      <w:r>
-        <w:rPr>
-          <w:sz w:val="18"/>
-          <w:szCs w:val="18"/>
-        </w:rPr>
-        <w:t/>
-      </w:r>
-      <w:proofErr w:type="spellEnd"/>
+        <w:t>Rel. &amp; Project Dev. Sumbagsel</w:t>
+      </w:r>
     </w:p>
     <w:p>
       <w:pPr>
@@ -2828,7 +3132,7 @@
                     <pic:cNvPicPr/>
                   </pic:nvPicPr>
                   <pic:blipFill>
-                    <a:blip r:embed="R7c06a5e0ed0545cd"/>
+                    <a:blip r:embed="Rd6c8e97d197e4e38"/>
                     <a:stretch>
                       <a:fillRect/>
                     </a:stretch>
@@ -4188,4 +4492,16 @@
     </a:ext>
   </a:extLst>
 </a:theme>
+</file>
+
+<file path=customXml/item1.xml><?xml version="1.0" encoding="utf-8"?>
+<b:Sources xmlns:b="http://schemas.openxmlformats.org/officeDocument/2006/bibliography" xmlns="http://schemas.openxmlformats.org/officeDocument/2006/bibliography" SelectedStyle="\APASixthEditionOfficeOnline.xsl" StyleName="APA" Version="6"/>
+</file>
+
+<file path=customXml/itemProps1.xml><?xml version="1.0" encoding="utf-8"?>
+<ds:datastoreItem xmlns:ds="http://schemas.openxmlformats.org/officeDocument/2006/customXml" ds:itemID="{64676D6A-85EA-405A-897C-7B03228A704F}">
+  <ds:schemaRefs>
+    <ds:schemaRef ds:uri="http://schemas.openxmlformats.org/officeDocument/2006/bibliography"/>
+  </ds:schemaRefs>
+</ds:datastoreItem>
 </file>
</xml_diff>